<commit_message>
docs: refresh english-study delivery docx exports
</commit_message>
<xml_diff>
--- a/var/workspace/projects/english-study/delivery/docx/05-收尾说明.docx
+++ b/var/workspace/projects/english-study/delivery/docx/05-收尾说明.docx
@@ -112,7 +112,164 @@
         <w:pStyle w:val="ListBullet"/>
       </w:pPr>
       <w:r>
+        <w:t>用户可见的关键前端/模板文案已补做一轮中文收口，包括任务标题、完成提示、错误页与日志页</w:t>
+      </w:r>
+    </w:p>
+    <w:p>
+      <w:pPr>
+        <w:pStyle w:val="ListBullet"/>
+      </w:pPr>
+      <w:r>
+        <w:t>误混入仓库源码和文档的占位截断文本已清理，</w:t>
+      </w:r>
+      <w:r>
+        <w:rPr>
+          <w:rFonts w:ascii="Consolas" w:hAnsi="Consolas"/>
+          <w:sz w:val="20"/>
+        </w:rPr>
+        <w:t>web/libs/editor/src/components/App/App.jsx</w:t>
+      </w:r>
+      <w:r>
+        <w:t xml:space="preserve"> 已从 source map 还原后再汉化</w:t>
+      </w:r>
+    </w:p>
+    <w:p>
+      <w:pPr>
+        <w:pStyle w:val="ListBullet"/>
+      </w:pPr>
+      <w:r>
         <w:t>交付文档已同时提供 Markdown 与 Word 版本</w:t>
+      </w:r>
+    </w:p>
+    <w:p>
+      <w:pPr>
+        <w:pStyle w:val="Heading2"/>
+      </w:pPr>
+      <w:r>
+        <w:t>1.1 本轮额外完成的界面与资产收口</w:t>
+      </w:r>
+    </w:p>
+    <w:p>
+      <w:r>
+        <w:t>这轮 closeout 额外完成了两类容易在交付后继续制造噪音的问题清理：</w:t>
+      </w:r>
+    </w:p>
+    <w:p>
+      <w:pPr>
+        <w:pStyle w:val="ListBullet"/>
+      </w:pPr>
+      <w:r>
+        <w:t xml:space="preserve">把直接暴露给用户的英文文案再收了一轮，覆盖 </w:t>
+      </w:r>
+      <w:r>
+        <w:rPr>
+          <w:rFonts w:ascii="Consolas" w:hAnsi="Consolas"/>
+          <w:sz w:val="20"/>
+        </w:rPr>
+        <w:t>web/libs/editor/src/components/App/App.jsx</w:t>
+      </w:r>
+      <w:r>
+        <w:t>、</w:t>
+      </w:r>
+      <w:r>
+        <w:rPr>
+          <w:rFonts w:ascii="Consolas" w:hAnsi="Consolas"/>
+          <w:sz w:val="20"/>
+        </w:rPr>
+        <w:t>web/libs/datamanager/src/components/App/App.jsx</w:t>
+      </w:r>
+      <w:r>
+        <w:t xml:space="preserve"> 以及 </w:t>
+      </w:r>
+      <w:r>
+        <w:rPr>
+          <w:rFonts w:ascii="Consolas" w:hAnsi="Consolas"/>
+          <w:sz w:val="20"/>
+        </w:rPr>
+        <w:t>label_studio/templates/401.html</w:t>
+      </w:r>
+      <w:r>
+        <w:t>、</w:t>
+      </w:r>
+      <w:r>
+        <w:rPr>
+          <w:rFonts w:ascii="Consolas" w:hAnsi="Consolas"/>
+          <w:sz w:val="20"/>
+        </w:rPr>
+        <w:t>403.html</w:t>
+      </w:r>
+      <w:r>
+        <w:t>、</w:t>
+      </w:r>
+      <w:r>
+        <w:rPr>
+          <w:rFonts w:ascii="Consolas" w:hAnsi="Consolas"/>
+          <w:sz w:val="20"/>
+        </w:rPr>
+        <w:t>404.html</w:t>
+      </w:r>
+      <w:r>
+        <w:t>、</w:t>
+      </w:r>
+      <w:r>
+        <w:rPr>
+          <w:rFonts w:ascii="Consolas" w:hAnsi="Consolas"/>
+          <w:sz w:val="20"/>
+        </w:rPr>
+        <w:t>500.html</w:t>
+      </w:r>
+      <w:r>
+        <w:t>、</w:t>
+      </w:r>
+      <w:r>
+        <w:rPr>
+          <w:rFonts w:ascii="Consolas" w:hAnsi="Consolas"/>
+          <w:sz w:val="20"/>
+        </w:rPr>
+        <w:t>log_files.html</w:t>
+      </w:r>
+    </w:p>
+    <w:p>
+      <w:pPr>
+        <w:pStyle w:val="ListBullet"/>
+      </w:pPr>
+      <w:r>
+        <w:t xml:space="preserve">把一批机械化改动的 </w:t>
+      </w:r>
+      <w:r>
+        <w:rPr>
+          <w:rFonts w:ascii="Consolas" w:hAnsi="Consolas"/>
+          <w:sz w:val="20"/>
+        </w:rPr>
+        <w:t>label_studio/core/static_build/*.js</w:t>
+      </w:r>
+      <w:r>
+        <w:t xml:space="preserve"> 编译产物全部退回基线，避免把无明确业务价值的产物改动混进 English-study 交付范围</w:t>
+      </w:r>
+    </w:p>
+    <w:p>
+      <w:r>
+        <w:t xml:space="preserve">其中 </w:t>
+      </w:r>
+      <w:r>
+        <w:rPr>
+          <w:rFonts w:ascii="Consolas" w:hAnsi="Consolas"/>
+          <w:sz w:val="20"/>
+        </w:rPr>
+        <w:t>docker-compose.yml</w:t>
+      </w:r>
+      <w:r>
+        <w:t xml:space="preserve"> 里新增的 </w:t>
+      </w:r>
+      <w:r>
+        <w:rPr>
+          <w:rFonts w:ascii="Consolas" w:hAnsi="Consolas"/>
+          <w:sz w:val="20"/>
+        </w:rPr>
+        <w:t>PLAYWRIGHT_BROWSERS_PATH</w:t>
+      </w:r>
+      <w:r>
+        <w:t xml:space="preserve"> 透传暂时不并入 English-study 交付结论：它是 OpenClaw 全局运行时配置，且默认空值，不设环境变量时不会启用。</w:t>
       </w:r>
     </w:p>
     <w:p>
@@ -396,17 +553,27 @@
         <w:pStyle w:val="ListNumber"/>
       </w:pPr>
       <w:r>
-        <w:t xml:space="preserve">保留这次回滚点后，再切回 OpenClaw 的 </w:t>
+        <w:t xml:space="preserve">单独决定是否保留根目录 </w:t>
       </w:r>
       <w:r>
         <w:rPr>
           <w:rFonts w:ascii="Consolas" w:hAnsi="Consolas"/>
           <w:sz w:val="20"/>
         </w:rPr>
-        <w:t>openclaw.json</w:t>
+        <w:t>docker-compose.yml</w:t>
       </w:r>
       <w:r>
-        <w:t xml:space="preserve"> 权限加固</w:t>
+        <w:t xml:space="preserve"> 里的 </w:t>
+      </w:r>
+      <w:r>
+        <w:rPr>
+          <w:rFonts w:ascii="Consolas" w:hAnsi="Consolas"/>
+          <w:sz w:val="20"/>
+        </w:rPr>
+        <w:t>PLAYWRIGHT_BROWSERS_PATH</w:t>
+      </w:r>
+      <w:r>
+        <w:t xml:space="preserve"> 可选透传</w:t>
       </w:r>
     </w:p>
     <w:sectPr>

</xml_diff>

<commit_message>
docs: align english-study guide and retained-file roles
</commit_message>
<xml_diff>
--- a/var/workspace/projects/english-study/delivery/docx/05-收尾说明.docx
+++ b/var/workspace/projects/english-study/delivery/docx/05-收尾说明.docx
@@ -245,6 +245,31 @@
       </w:r>
       <w:r>
         <w:t xml:space="preserve"> 编译产物全部退回基线，避免把无明确业务价值的产物改动混进 English-study 交付范围</w:t>
+      </w:r>
+    </w:p>
+    <w:p>
+      <w:pPr>
+        <w:pStyle w:val="ListBullet"/>
+      </w:pPr>
+      <w:r>
+        <w:rPr>
+          <w:rFonts w:ascii="Consolas" w:hAnsi="Consolas"/>
+          <w:sz w:val="20"/>
+        </w:rPr>
+        <w:t>用户指南.md</w:t>
+      </w:r>
+      <w:r>
+        <w:t xml:space="preserve"> 继续保留为仓库内中文操作说明，但口径已改回 English-study；</w:t>
+      </w:r>
+      <w:r>
+        <w:rPr>
+          <w:rFonts w:ascii="Consolas" w:hAnsi="Consolas"/>
+          <w:sz w:val="20"/>
+        </w:rPr>
+        <w:t>roadmap.md</w:t>
+      </w:r>
+      <w:r>
+        <w:t xml:space="preserve"> 则仅作为上游历史参考，不作为当前交付承诺的一部分</w:t>
       </w:r>
     </w:p>
     <w:p>

</xml_diff>

<commit_message>
docs: split english-study static asset roles
</commit_message>
<xml_diff>
--- a/var/workspace/projects/english-study/delivery/docx/05-收尾说明.docx
+++ b/var/workspace/projects/english-study/delivery/docx/05-收尾说明.docx
@@ -273,6 +273,122 @@
       </w:r>
     </w:p>
     <w:p>
+      <w:pPr>
+        <w:pStyle w:val="ListBullet"/>
+      </w:pPr>
+      <w:r>
+        <w:t xml:space="preserve">已明确 </w:t>
+      </w:r>
+      <w:r>
+        <w:rPr>
+          <w:rFonts w:ascii="Consolas" w:hAnsi="Consolas"/>
+          <w:sz w:val="20"/>
+        </w:rPr>
+        <w:t>web/dist/apps/labelstudio/</w:t>
+      </w:r>
+      <w:r>
+        <w:t>、</w:t>
+      </w:r>
+      <w:r>
+        <w:rPr>
+          <w:rFonts w:ascii="Consolas" w:hAnsi="Consolas"/>
+          <w:sz w:val="20"/>
+        </w:rPr>
+        <w:t>web/dist/libs/editor/</w:t>
+      </w:r>
+      <w:r>
+        <w:t>、</w:t>
+      </w:r>
+      <w:r>
+        <w:rPr>
+          <w:rFonts w:ascii="Consolas" w:hAnsi="Consolas"/>
+          <w:sz w:val="20"/>
+        </w:rPr>
+        <w:t>web/dist/libs/datamanager/</w:t>
+      </w:r>
+      <w:r>
+        <w:t xml:space="preserve"> 不是可随手删掉的备份目录，而是被 </w:t>
+      </w:r>
+      <w:r>
+        <w:rPr>
+          <w:rFonts w:ascii="Consolas" w:hAnsi="Consolas"/>
+          <w:sz w:val="20"/>
+        </w:rPr>
+        <w:t>pyproject.toml</w:t>
+      </w:r>
+      <w:r>
+        <w:t xml:space="preserve"> 打包、被 </w:t>
+      </w:r>
+      <w:r>
+        <w:rPr>
+          <w:rFonts w:ascii="Consolas" w:hAnsi="Consolas"/>
+          <w:sz w:val="20"/>
+        </w:rPr>
+        <w:t>label_studio/core/settings/base.py</w:t>
+      </w:r>
+      <w:r>
+        <w:t xml:space="preserve"> 运行时直接指向的必需前端产物；同时 </w:t>
+      </w:r>
+      <w:r>
+        <w:rPr>
+          <w:rFonts w:ascii="Consolas" w:hAnsi="Consolas"/>
+          <w:sz w:val="20"/>
+        </w:rPr>
+        <w:t>web/apps/.../src</w:t>
+      </w:r>
+      <w:r>
+        <w:t xml:space="preserve"> 与 </w:t>
+      </w:r>
+      <w:r>
+        <w:rPr>
+          <w:rFonts w:ascii="Consolas" w:hAnsi="Consolas"/>
+          <w:sz w:val="20"/>
+        </w:rPr>
+        <w:t>web/libs/.../src</w:t>
+      </w:r>
+      <w:r>
+        <w:t xml:space="preserve"> 继续作为后续源码修复入口保留</w:t>
+      </w:r>
+    </w:p>
+    <w:p>
+      <w:pPr>
+        <w:pStyle w:val="ListBullet"/>
+      </w:pPr>
+      <w:r>
+        <w:t xml:space="preserve">已把 </w:t>
+      </w:r>
+      <w:r>
+        <w:rPr>
+          <w:rFonts w:ascii="Consolas" w:hAnsi="Consolas"/>
+          <w:sz w:val="20"/>
+        </w:rPr>
+        <w:t>label_studio/core/static/</w:t>
+      </w:r>
+      <w:r>
+        <w:t xml:space="preserve"> 初步拆成两层：模板壳/登录页/错误页/API 文档页直接引用的 CSS、JS、图标和图片归入运行时必需层，而 </w:t>
+      </w:r>
+      <w:r>
+        <w:rPr>
+          <w:rFonts w:ascii="Consolas" w:hAnsi="Consolas"/>
+          <w:sz w:val="20"/>
+        </w:rPr>
+        <w:t>templates/</w:t>
+      </w:r>
+      <w:r>
+        <w:t>、</w:t>
+      </w:r>
+      <w:r>
+        <w:rPr>
+          <w:rFonts w:ascii="Consolas" w:hAnsi="Consolas"/>
+          <w:sz w:val="20"/>
+        </w:rPr>
+        <w:t>samples/</w:t>
+      </w:r>
+      <w:r>
+        <w:t xml:space="preserve"> 这类更偏上游模板库与示例数据的配套资源，进入后续场景化复审</w:t>
+      </w:r>
+    </w:p>
+    <w:p>
       <w:r>
         <w:t xml:space="preserve">其中 </w:t>
       </w:r>
@@ -542,7 +658,17 @@
         <w:pStyle w:val="ListNumber"/>
       </w:pPr>
       <w:r>
-        <w:t>审视这批上游补回文件的实际保留范围</w:t>
+        <w:t xml:space="preserve">继续把 </w:t>
+      </w:r>
+      <w:r>
+        <w:rPr>
+          <w:rFonts w:ascii="Consolas" w:hAnsi="Consolas"/>
+          <w:sz w:val="20"/>
+        </w:rPr>
+        <w:t>label_studio/core/static/</w:t>
+      </w:r>
+      <w:r>
+        <w:t xml:space="preserve"> 往文件级拆细，优先确认页面壳直接引用资源之外，哪些模板库/示例资源在 English-study 实际流程里还需要</w:t>
       </w:r>
     </w:p>
     <w:p>

</xml_diff>

<commit_message>
docs: classify english-study template asset roles
</commit_message>
<xml_diff>
--- a/var/workspace/projects/english-study/delivery/docx/05-收尾说明.docx
+++ b/var/workspace/projects/english-study/delivery/docx/05-收尾说明.docx
@@ -386,6 +386,64 @@
       </w:r>
       <w:r>
         <w:t xml:space="preserve"> 这类更偏上游模板库与示例数据的配套资源，进入后续场景化复审</w:t>
+      </w:r>
+    </w:p>
+    <w:p>
+      <w:pPr>
+        <w:pStyle w:val="ListBullet"/>
+      </w:pPr>
+      <w:r>
+        <w:t xml:space="preserve">已确认 </w:t>
+      </w:r>
+      <w:r>
+        <w:rPr>
+          <w:rFonts w:ascii="Consolas" w:hAnsi="Consolas"/>
+          <w:sz w:val="20"/>
+        </w:rPr>
+        <w:t>label_studio/annotation_templates/</w:t>
+      </w:r>
+      <w:r>
+        <w:t xml:space="preserve"> 不能简单归类为“纯示例目录”：</w:t>
+      </w:r>
+      <w:r>
+        <w:rPr>
+          <w:rFonts w:ascii="Consolas" w:hAnsi="Consolas"/>
+          <w:sz w:val="20"/>
+        </w:rPr>
+        <w:t>label_studio/projects/api.py</w:t>
+      </w:r>
+      <w:r>
+        <w:t xml:space="preserve"> 的模板列表接口会直接扫描其中的 </w:t>
+      </w:r>
+      <w:r>
+        <w:rPr>
+          <w:rFonts w:ascii="Consolas" w:hAnsi="Consolas"/>
+          <w:sz w:val="20"/>
+        </w:rPr>
+        <w:t>*.yml</w:t>
+      </w:r>
+      <w:r>
+        <w:t xml:space="preserve"> 与 </w:t>
+      </w:r>
+      <w:r>
+        <w:rPr>
+          <w:rFonts w:ascii="Consolas" w:hAnsi="Consolas"/>
+          <w:sz w:val="20"/>
+        </w:rPr>
+        <w:t>groups.txt</w:t>
+      </w:r>
+      <w:r>
+        <w:t>；相对地，</w:t>
+      </w:r>
+      <w:r>
+        <w:rPr>
+          <w:rFonts w:ascii="Consolas" w:hAnsi="Consolas"/>
+          <w:sz w:val="20"/>
+        </w:rPr>
+        <w:t>label_studio/core/examples/</w:t>
+      </w:r>
+      <w:r>
+        <w:t xml:space="preserve"> 目前仍更像上游演示配置集合</w:t>
       </w:r>
     </w:p>
     <w:p>

</xml_diff>

<commit_message>
docs: refine english-study sample asset boundaries
</commit_message>
<xml_diff>
--- a/var/workspace/projects/english-study/delivery/docx/05-收尾说明.docx
+++ b/var/workspace/projects/english-study/delivery/docx/05-收尾说明.docx
@@ -447,6 +447,72 @@
       </w:r>
     </w:p>
     <w:p>
+      <w:pPr>
+        <w:pStyle w:val="ListBullet"/>
+      </w:pPr>
+      <w:r>
+        <w:t xml:space="preserve">已把 </w:t>
+      </w:r>
+      <w:r>
+        <w:rPr>
+          <w:rFonts w:ascii="Consolas" w:hAnsi="Consolas"/>
+          <w:sz w:val="20"/>
+        </w:rPr>
+        <w:t>label_studio/core/static/templates/</w:t>
+      </w:r>
+      <w:r>
+        <w:t xml:space="preserve"> 与 </w:t>
+      </w:r>
+      <w:r>
+        <w:rPr>
+          <w:rFonts w:ascii="Consolas" w:hAnsi="Consolas"/>
+          <w:sz w:val="20"/>
+        </w:rPr>
+        <w:t>label_studio/core/static/samples/</w:t>
+      </w:r>
+      <w:r>
+        <w:t xml:space="preserve"> 再细分：前者大部分是当前模板列表会直接展示的封面图，后者同时包含模板直引样例、</w:t>
+      </w:r>
+      <w:r>
+        <w:rPr>
+          <w:rFonts w:ascii="Consolas" w:hAnsi="Consolas"/>
+          <w:sz w:val="20"/>
+        </w:rPr>
+        <w:t>/samples/*</w:t>
+      </w:r>
+      <w:r>
+        <w:t xml:space="preserve"> 后端示例接口依赖，以及只在 API 示例/测试里出现的更弱耦合资源</w:t>
+      </w:r>
+    </w:p>
+    <w:p>
+      <w:pPr>
+        <w:pStyle w:val="ListBullet"/>
+      </w:pPr>
+      <w:r>
+        <w:t>已发现一个待确认缺口：</w:t>
+      </w:r>
+      <w:r>
+        <w:rPr>
+          <w:rFonts w:ascii="Consolas" w:hAnsi="Consolas"/>
+          <w:sz w:val="20"/>
+        </w:rPr>
+        <w:t>label_studio/core/utils/schema/data_examples.json</w:t>
+      </w:r>
+      <w:r>
+        <w:t xml:space="preserve"> 仍引用 </w:t>
+      </w:r>
+      <w:r>
+        <w:rPr>
+          <w:rFonts w:ascii="Consolas" w:hAnsi="Consolas"/>
+          <w:sz w:val="20"/>
+        </w:rPr>
+        <w:t>/static/samples/sample-task-sin-headless.csv</w:t>
+      </w:r>
+      <w:r>
+        <w:t>，但当前工作树没有该文件；这一点更像上游示例链路问题，已纳入边界复审，而不是直接补成 English-study 必需资产</w:t>
+      </w:r>
+    </w:p>
+    <w:p>
       <w:r>
         <w:t xml:space="preserve">其中 </w:t>
       </w:r>

</xml_diff>

<commit_message>
docs: close english-study sample dead-end findings
</commit_message>
<xml_diff>
--- a/var/workspace/projects/english-study/delivery/docx/05-收尾说明.docx
+++ b/var/workspace/projects/english-study/delivery/docx/05-收尾说明.docx
@@ -489,7 +489,7 @@
         <w:pStyle w:val="ListBullet"/>
       </w:pPr>
       <w:r>
-        <w:t>已发现一个待确认缺口：</w:t>
+        <w:t xml:space="preserve">已确认 </w:t>
       </w:r>
       <w:r>
         <w:rPr>
@@ -499,7 +499,7 @@
         <w:t>label_studio/core/utils/schema/data_examples.json</w:t>
       </w:r>
       <w:r>
-        <w:t xml:space="preserve"> 仍引用 </w:t>
+        <w:t xml:space="preserve"> 中的 </w:t>
       </w:r>
       <w:r>
         <w:rPr>
@@ -509,7 +509,55 @@
         <w:t>/static/samples/sample-task-sin-headless.csv</w:t>
       </w:r>
       <w:r>
-        <w:t>，但当前工作树没有该文件；这一点更像上游示例链路问题，已纳入边界复审，而不是直接补成 English-study 必需资产</w:t>
+        <w:t xml:space="preserve"> 不是 English-study 当前交付缺件：工作树与仓库历史里都没有这个文件，而同样的引用也存在于 </w:t>
+      </w:r>
+      <w:r>
+        <w:rPr>
+          <w:rFonts w:ascii="Consolas" w:hAnsi="Consolas"/>
+          <w:sz w:val="20"/>
+        </w:rPr>
+        <w:t>.venv</w:t>
+      </w:r>
+      <w:r>
+        <w:t xml:space="preserve"> 的 </w:t>
+      </w:r>
+      <w:r>
+        <w:rPr>
+          <w:rFonts w:ascii="Consolas" w:hAnsi="Consolas"/>
+          <w:sz w:val="20"/>
+        </w:rPr>
+        <w:t>label_studio_sdk/label_interface/data_examples.json</w:t>
+      </w:r>
+      <w:r>
+        <w:t>，更像上游示例定义里的死引用</w:t>
+      </w:r>
+    </w:p>
+    <w:p>
+      <w:pPr>
+        <w:pStyle w:val="ListBullet"/>
+      </w:pPr>
+      <w:r>
+        <w:t xml:space="preserve">那 6 张未被模板 YAML 命中的 </w:t>
+      </w:r>
+      <w:r>
+        <w:rPr>
+          <w:rFonts w:ascii="Consolas" w:hAnsi="Consolas"/>
+          <w:sz w:val="20"/>
+        </w:rPr>
+        <w:t>core/static/templates/*.png</w:t>
+      </w:r>
+      <w:r>
+        <w:t xml:space="preserve"> 在排除 </w:t>
+      </w:r>
+      <w:r>
+        <w:rPr>
+          <w:rFonts w:ascii="Consolas" w:hAnsi="Consolas"/>
+          <w:sz w:val="20"/>
+        </w:rPr>
+        <w:t>static_build/staticfiles.json</w:t>
+      </w:r>
+      <w:r>
+        <w:t xml:space="preserve"> 后也没有查到其他活引用，因此目前可按“上游模板封面残留”处理，而不是当前 English-study 必需资产</w:t>
       </w:r>
     </w:p>
     <w:p>

</xml_diff>

<commit_message>
docs: map english-study django runtime chain
</commit_message>
<xml_diff>
--- a/var/workspace/projects/english-study/delivery/docx/05-收尾说明.docx
+++ b/var/workspace/projects/english-study/delivery/docx/05-收尾说明.docx
@@ -561,6 +561,184 @@
       </w:r>
     </w:p>
     <w:p>
+      <w:pPr>
+        <w:pStyle w:val="ListBullet"/>
+      </w:pPr>
+      <w:r>
+        <w:t xml:space="preserve">已把 </w:t>
+      </w:r>
+      <w:r>
+        <w:rPr>
+          <w:rFonts w:ascii="Consolas" w:hAnsi="Consolas"/>
+          <w:sz w:val="20"/>
+        </w:rPr>
+        <w:t>label_studio/(other)</w:t>
+      </w:r>
+      <w:r>
+        <w:t xml:space="preserve"> 进一步拆开：至少 </w:t>
+      </w:r>
+      <w:r>
+        <w:rPr>
+          <w:rFonts w:ascii="Consolas" w:hAnsi="Consolas"/>
+          <w:sz w:val="20"/>
+        </w:rPr>
+        <w:t>users</w:t>
+      </w:r>
+      <w:r>
+        <w:t>、</w:t>
+      </w:r>
+      <w:r>
+        <w:rPr>
+          <w:rFonts w:ascii="Consolas" w:hAnsi="Consolas"/>
+          <w:sz w:val="20"/>
+        </w:rPr>
+        <w:t>organizations</w:t>
+      </w:r>
+      <w:r>
+        <w:t>、</w:t>
+      </w:r>
+      <w:r>
+        <w:rPr>
+          <w:rFonts w:ascii="Consolas" w:hAnsi="Consolas"/>
+          <w:sz w:val="20"/>
+        </w:rPr>
+        <w:t>projects</w:t>
+      </w:r>
+      <w:r>
+        <w:t>、</w:t>
+      </w:r>
+      <w:r>
+        <w:rPr>
+          <w:rFonts w:ascii="Consolas" w:hAnsi="Consolas"/>
+          <w:sz w:val="20"/>
+        </w:rPr>
+        <w:t>tasks</w:t>
+      </w:r>
+      <w:r>
+        <w:t>、</w:t>
+      </w:r>
+      <w:r>
+        <w:rPr>
+          <w:rFonts w:ascii="Consolas" w:hAnsi="Consolas"/>
+          <w:sz w:val="20"/>
+        </w:rPr>
+        <w:t>data_import</w:t>
+      </w:r>
+      <w:r>
+        <w:t>、</w:t>
+      </w:r>
+      <w:r>
+        <w:rPr>
+          <w:rFonts w:ascii="Consolas" w:hAnsi="Consolas"/>
+          <w:sz w:val="20"/>
+        </w:rPr>
+        <w:t>data_manager</w:t>
+      </w:r>
+      <w:r>
+        <w:t>、</w:t>
+      </w:r>
+      <w:r>
+        <w:rPr>
+          <w:rFonts w:ascii="Consolas" w:hAnsi="Consolas"/>
+          <w:sz w:val="20"/>
+        </w:rPr>
+        <w:t>data_export</w:t>
+      </w:r>
+      <w:r>
+        <w:t>、</w:t>
+      </w:r>
+      <w:r>
+        <w:rPr>
+          <w:rFonts w:ascii="Consolas" w:hAnsi="Consolas"/>
+          <w:sz w:val="20"/>
+        </w:rPr>
+        <w:t>io_storages</w:t>
+      </w:r>
+      <w:r>
+        <w:t>、</w:t>
+      </w:r>
+      <w:r>
+        <w:rPr>
+          <w:rFonts w:ascii="Consolas" w:hAnsi="Consolas"/>
+          <w:sz w:val="20"/>
+        </w:rPr>
+        <w:t>ml</w:t>
+      </w:r>
+      <w:r>
+        <w:t>、</w:t>
+      </w:r>
+      <w:r>
+        <w:rPr>
+          <w:rFonts w:ascii="Consolas" w:hAnsi="Consolas"/>
+          <w:sz w:val="20"/>
+        </w:rPr>
+        <w:t>webhooks</w:t>
+      </w:r>
+      <w:r>
+        <w:t>、</w:t>
+      </w:r>
+      <w:r>
+        <w:rPr>
+          <w:rFonts w:ascii="Consolas" w:hAnsi="Consolas"/>
+          <w:sz w:val="20"/>
+        </w:rPr>
+        <w:t>labels_manager</w:t>
+      </w:r>
+      <w:r>
+        <w:t>、</w:t>
+      </w:r>
+      <w:r>
+        <w:rPr>
+          <w:rFonts w:ascii="Consolas" w:hAnsi="Consolas"/>
+          <w:sz w:val="20"/>
+        </w:rPr>
+        <w:t>ml_models</w:t>
+      </w:r>
+      <w:r>
+        <w:t>、</w:t>
+      </w:r>
+      <w:r>
+        <w:rPr>
+          <w:rFonts w:ascii="Consolas" w:hAnsi="Consolas"/>
+          <w:sz w:val="20"/>
+        </w:rPr>
+        <w:t>ml_model_providers</w:t>
+      </w:r>
+      <w:r>
+        <w:t xml:space="preserve"> 已被 </w:t>
+      </w:r>
+      <w:r>
+        <w:rPr>
+          <w:rFonts w:ascii="Consolas" w:hAnsi="Consolas"/>
+          <w:sz w:val="20"/>
+        </w:rPr>
+        <w:t>INSTALLED_APPS</w:t>
+      </w:r>
+      <w:r>
+        <w:t>、</w:t>
+      </w:r>
+      <w:r>
+        <w:rPr>
+          <w:rFonts w:ascii="Consolas" w:hAnsi="Consolas"/>
+          <w:sz w:val="20"/>
+        </w:rPr>
+        <w:t>core/urls.py</w:t>
+      </w:r>
+      <w:r>
+        <w:t xml:space="preserve"> 或 </w:t>
+      </w:r>
+      <w:r>
+        <w:rPr>
+          <w:rFonts w:ascii="Consolas" w:hAnsi="Consolas"/>
+          <w:sz w:val="20"/>
+        </w:rPr>
+        <w:t>server.py</w:t>
+      </w:r>
+      <w:r>
+        <w:t xml:space="preserve"> 挂进当前 Django 启动链，不再和真正未证实接线的上游目录混成一类</w:t>
+      </w:r>
+    </w:p>
+    <w:p>
       <w:r>
         <w:t xml:space="preserve">其中 </w:t>
       </w:r>
@@ -830,17 +1008,17 @@
         <w:pStyle w:val="ListNumber"/>
       </w:pPr>
       <w:r>
-        <w:t xml:space="preserve">继续把 </w:t>
+        <w:t xml:space="preserve">继续收窄尚未挂入当前 Django 启动链的 </w:t>
       </w:r>
       <w:r>
         <w:rPr>
           <w:rFonts w:ascii="Consolas" w:hAnsi="Consolas"/>
           <w:sz w:val="20"/>
         </w:rPr>
-        <w:t>label_studio/core/static/</w:t>
+        <w:t>label_studio/</w:t>
       </w:r>
       <w:r>
-        <w:t xml:space="preserve"> 往文件级拆细，优先确认页面壳直接引用资源之外，哪些模板库/示例资源在 English-study 实际流程里还需要</w:t>
+        <w:t xml:space="preserve"> 其余目录，优先找真正未接线的上游资料、脚本和示例包</w:t>
       </w:r>
     </w:p>
     <w:p>

</xml_diff>

<commit_message>
docs: split english-study root runtime and test assets
</commit_message>
<xml_diff>
--- a/var/workspace/projects/english-study/delivery/docx/05-收尾说明.docx
+++ b/var/workspace/projects/english-study/delivery/docx/05-收尾说明.docx
@@ -739,6 +739,101 @@
       </w:r>
     </w:p>
     <w:p>
+      <w:pPr>
+        <w:pStyle w:val="ListBullet"/>
+      </w:pPr>
+      <w:r>
+        <w:rPr>
+          <w:rFonts w:ascii="Consolas" w:hAnsi="Consolas"/>
+          <w:sz w:val="20"/>
+        </w:rPr>
+        <w:t>label_studio/</w:t>
+      </w:r>
+      <w:r>
+        <w:t xml:space="preserve"> 顶层也已初步拆清：</w:t>
+      </w:r>
+      <w:r>
+        <w:rPr>
+          <w:rFonts w:ascii="Consolas" w:hAnsi="Consolas"/>
+          <w:sz w:val="20"/>
+        </w:rPr>
+        <w:t>manage.py</w:t>
+      </w:r>
+      <w:r>
+        <w:t>、</w:t>
+      </w:r>
+      <w:r>
+        <w:rPr>
+          <w:rFonts w:ascii="Consolas" w:hAnsi="Consolas"/>
+          <w:sz w:val="20"/>
+        </w:rPr>
+        <w:t>server.py</w:t>
+      </w:r>
+      <w:r>
+        <w:t>、</w:t>
+      </w:r>
+      <w:r>
+        <w:rPr>
+          <w:rFonts w:ascii="Consolas" w:hAnsi="Consolas"/>
+          <w:sz w:val="20"/>
+        </w:rPr>
+        <w:t>feature_flags.json</w:t>
+      </w:r>
+      <w:r>
+        <w:t>、</w:t>
+      </w:r>
+      <w:r>
+        <w:rPr>
+          <w:rFonts w:ascii="Consolas" w:hAnsi="Consolas"/>
+          <w:sz w:val="20"/>
+        </w:rPr>
+        <w:t>constants.py</w:t>
+      </w:r>
+      <w:r>
+        <w:t xml:space="preserve"> 属于当前运行/配置链，而 </w:t>
+      </w:r>
+      <w:r>
+        <w:rPr>
+          <w:rFonts w:ascii="Consolas" w:hAnsi="Consolas"/>
+          <w:sz w:val="20"/>
+        </w:rPr>
+        <w:t>tests/</w:t>
+      </w:r>
+      <w:r>
+        <w:t>、</w:t>
+      </w:r>
+      <w:r>
+        <w:rPr>
+          <w:rFonts w:ascii="Consolas" w:hAnsi="Consolas"/>
+          <w:sz w:val="20"/>
+        </w:rPr>
+        <w:t>pytest.ini</w:t>
+      </w:r>
+      <w:r>
+        <w:t>、</w:t>
+      </w:r>
+      <w:r>
+        <w:rPr>
+          <w:rFonts w:ascii="Consolas" w:hAnsi="Consolas"/>
+          <w:sz w:val="20"/>
+        </w:rPr>
+        <w:t>.coveragerc</w:t>
+      </w:r>
+      <w:r>
+        <w:t>、</w:t>
+      </w:r>
+      <w:r>
+        <w:rPr>
+          <w:rFonts w:ascii="Consolas" w:hAnsi="Consolas"/>
+          <w:sz w:val="20"/>
+        </w:rPr>
+        <w:t>sitecustomize.py</w:t>
+      </w:r>
+      <w:r>
+        <w:t xml:space="preserve"> 更偏测试和覆盖率辅助资产</w:t>
+      </w:r>
+    </w:p>
+    <w:p>
       <w:r>
         <w:t xml:space="preserve">其中 </w:t>
       </w:r>
@@ -1008,7 +1103,7 @@
         <w:pStyle w:val="ListNumber"/>
       </w:pPr>
       <w:r>
-        <w:t xml:space="preserve">继续收窄尚未挂入当前 Django 启动链的 </w:t>
+        <w:t xml:space="preserve">继续收窄尚未挂入当前 Django 启动链、且不属于根目录运行入口/测试辅助资产的 </w:t>
       </w:r>
       <w:r>
         <w:rPr>
@@ -1018,7 +1113,7 @@
         <w:t>label_studio/</w:t>
       </w:r>
       <w:r>
-        <w:t xml:space="preserve"> 其余目录，优先找真正未接线的上游资料、脚本和示例包</w:t>
+        <w:t xml:space="preserve"> 其余内容</w:t>
       </w:r>
     </w:p>
     <w:p>

</xml_diff>

<commit_message>
docs: split english-study core runtime helpers
</commit_message>
<xml_diff>
--- a/var/workspace/projects/english-study/delivery/docx/05-收尾说明.docx
+++ b/var/workspace/projects/english-study/delivery/docx/05-收尾说明.docx
@@ -834,6 +834,61 @@
       </w:r>
     </w:p>
     <w:p>
+      <w:pPr>
+        <w:pStyle w:val="ListBullet"/>
+      </w:pPr>
+      <w:r>
+        <w:rPr>
+          <w:rFonts w:ascii="Consolas" w:hAnsi="Consolas"/>
+          <w:sz w:val="20"/>
+        </w:rPr>
+        <w:t>label_studio/core/</w:t>
+      </w:r>
+      <w:r>
+        <w:t xml:space="preserve"> 里也补了一层角色拆分：</w:t>
+      </w:r>
+      <w:r>
+        <w:rPr>
+          <w:rFonts w:ascii="Consolas" w:hAnsi="Consolas"/>
+          <w:sz w:val="20"/>
+        </w:rPr>
+        <w:t>core/templatetags/filters.py</w:t>
+      </w:r>
+      <w:r>
+        <w:t xml:space="preserve"> 仍被项目页和用户页模板直接加载，属于运行链；而 </w:t>
+      </w:r>
+      <w:r>
+        <w:rPr>
+          <w:rFonts w:ascii="Consolas" w:hAnsi="Consolas"/>
+          <w:sz w:val="20"/>
+        </w:rPr>
+        <w:t>core/all_urls.json</w:t>
+      </w:r>
+      <w:r>
+        <w:t>、</w:t>
+      </w:r>
+      <w:r>
+        <w:rPr>
+          <w:rFonts w:ascii="Consolas" w:hAnsi="Consolas"/>
+          <w:sz w:val="20"/>
+        </w:rPr>
+        <w:t>core/version_.py</w:t>
+      </w:r>
+      <w:r>
+        <w:t>、</w:t>
+      </w:r>
+      <w:r>
+        <w:rPr>
+          <w:rFonts w:ascii="Consolas" w:hAnsi="Consolas"/>
+          <w:sz w:val="20"/>
+        </w:rPr>
+        <w:t>core/ls-version_.py</w:t>
+      </w:r>
+      <w:r>
+        <w:t xml:space="preserve"> 更像上下文诊断或版本快照辅助件</w:t>
+      </w:r>
+    </w:p>
+    <w:p>
       <w:r>
         <w:t xml:space="preserve">其中 </w:t>
       </w:r>
@@ -1103,7 +1158,7 @@
         <w:pStyle w:val="ListNumber"/>
       </w:pPr>
       <w:r>
-        <w:t xml:space="preserve">继续收窄尚未挂入当前 Django 启动链、且不属于根目录运行入口/测试辅助资产的 </w:t>
+        <w:t xml:space="preserve">继续收窄尚未挂入当前 Django 启动链、且不属于根目录运行入口、模板标签支撑件或测试/版本辅助资产的 </w:t>
       </w:r>
       <w:r>
         <w:rPr>

</xml_diff>

<commit_message>
docs: classify english-study core top-level files
</commit_message>
<xml_diff>
--- a/var/workspace/projects/english-study/delivery/docx/05-收尾说明.docx
+++ b/var/workspace/projects/english-study/delivery/docx/05-收尾说明.docx
@@ -889,6 +889,151 @@
       </w:r>
     </w:p>
     <w:p>
+      <w:pPr>
+        <w:pStyle w:val="ListBullet"/>
+      </w:pPr>
+      <w:r>
+        <w:rPr>
+          <w:rFonts w:ascii="Consolas" w:hAnsi="Consolas"/>
+          <w:sz w:val="20"/>
+        </w:rPr>
+        <w:t>label_studio/core/</w:t>
+      </w:r>
+      <w:r>
+        <w:t xml:space="preserve"> 顶层散落的 Python 文件也已做了一轮去噪：</w:t>
+      </w:r>
+      <w:r>
+        <w:rPr>
+          <w:rFonts w:ascii="Consolas" w:hAnsi="Consolas"/>
+          <w:sz w:val="20"/>
+        </w:rPr>
+        <w:t>api_permissions.py</w:t>
+      </w:r>
+      <w:r>
+        <w:t>、</w:t>
+      </w:r>
+      <w:r>
+        <w:rPr>
+          <w:rFonts w:ascii="Consolas" w:hAnsi="Consolas"/>
+          <w:sz w:val="20"/>
+        </w:rPr>
+        <w:t>argparser.py</w:t>
+      </w:r>
+      <w:r>
+        <w:t>、</w:t>
+      </w:r>
+      <w:r>
+        <w:rPr>
+          <w:rFonts w:ascii="Consolas" w:hAnsi="Consolas"/>
+          <w:sz w:val="20"/>
+        </w:rPr>
+        <w:t>context_processors.py</w:t>
+      </w:r>
+      <w:r>
+        <w:t>、</w:t>
+      </w:r>
+      <w:r>
+        <w:rPr>
+          <w:rFonts w:ascii="Consolas" w:hAnsi="Consolas"/>
+          <w:sz w:val="20"/>
+        </w:rPr>
+        <w:t>middleware.py</w:t>
+      </w:r>
+      <w:r>
+        <w:t>、</w:t>
+      </w:r>
+      <w:r>
+        <w:rPr>
+          <w:rFonts w:ascii="Consolas" w:hAnsi="Consolas"/>
+          <w:sz w:val="20"/>
+        </w:rPr>
+        <w:t>storage.py</w:t>
+      </w:r>
+      <w:r>
+        <w:t>、</w:t>
+      </w:r>
+      <w:r>
+        <w:rPr>
+          <w:rFonts w:ascii="Consolas" w:hAnsi="Consolas"/>
+          <w:sz w:val="20"/>
+        </w:rPr>
+        <w:t>label_config.py</w:t>
+      </w:r>
+      <w:r>
+        <w:t>、</w:t>
+      </w:r>
+      <w:r>
+        <w:rPr>
+          <w:rFonts w:ascii="Consolas" w:hAnsi="Consolas"/>
+          <w:sz w:val="20"/>
+        </w:rPr>
+        <w:t>permissions.py</w:t>
+      </w:r>
+      <w:r>
+        <w:t>、</w:t>
+      </w:r>
+      <w:r>
+        <w:rPr>
+          <w:rFonts w:ascii="Consolas" w:hAnsi="Consolas"/>
+          <w:sz w:val="20"/>
+        </w:rPr>
+        <w:t>redis.py</w:t>
+      </w:r>
+      <w:r>
+        <w:t>、</w:t>
+      </w:r>
+      <w:r>
+        <w:rPr>
+          <w:rFonts w:ascii="Consolas" w:hAnsi="Consolas"/>
+          <w:sz w:val="20"/>
+        </w:rPr>
+        <w:t>mixins.py</w:t>
+      </w:r>
+      <w:r>
+        <w:t>、</w:t>
+      </w:r>
+      <w:r>
+        <w:rPr>
+          <w:rFonts w:ascii="Consolas" w:hAnsi="Consolas"/>
+          <w:sz w:val="20"/>
+        </w:rPr>
+        <w:t>models.py</w:t>
+      </w:r>
+      <w:r>
+        <w:t>、</w:t>
+      </w:r>
+      <w:r>
+        <w:rPr>
+          <w:rFonts w:ascii="Consolas" w:hAnsi="Consolas"/>
+          <w:sz w:val="20"/>
+        </w:rPr>
+        <w:t>validators.py</w:t>
+      </w:r>
+      <w:r>
+        <w:t>、</w:t>
+      </w:r>
+      <w:r>
+        <w:rPr>
+          <w:rFonts w:ascii="Consolas" w:hAnsi="Consolas"/>
+          <w:sz w:val="20"/>
+        </w:rPr>
+        <w:t>views.py</w:t>
+      </w:r>
+      <w:r>
+        <w:t>、</w:t>
+      </w:r>
+      <w:r>
+        <w:rPr>
+          <w:rFonts w:ascii="Consolas" w:hAnsi="Consolas"/>
+          <w:sz w:val="20"/>
+        </w:rPr>
+        <w:t>wsgi.py</w:t>
+      </w:r>
+      <w:r>
+        <w:t xml:space="preserve"> 等都已经能沿着 settings、urls、server 或活跃 app import 链对上当前运行路径</w:t>
+      </w:r>
+    </w:p>
+    <w:p>
       <w:r>
         <w:t xml:space="preserve">其中 </w:t>
       </w:r>
@@ -1158,7 +1303,17 @@
         <w:pStyle w:val="ListNumber"/>
       </w:pPr>
       <w:r>
-        <w:t xml:space="preserve">继续收窄尚未挂入当前 Django 启动链、且不属于根目录运行入口、模板标签支撑件或测试/版本辅助资产的 </w:t>
+        <w:t>继续收窄尚未挂入当前 Django 启动链、且不属于根目录运行入口、</w:t>
+      </w:r>
+      <w:r>
+        <w:rPr>
+          <w:rFonts w:ascii="Consolas" w:hAnsi="Consolas"/>
+          <w:sz w:val="20"/>
+        </w:rPr>
+        <w:t>core/</w:t>
+      </w:r>
+      <w:r>
+        <w:t xml:space="preserve"> 运行支撑件、模板标签支撑件或测试/版本辅助资产的 </w:t>
       </w:r>
       <w:r>
         <w:rPr>

</xml_diff>